<commit_message>
Update uploadable assets for book publishing
Add new book assets including cover images and manuscripts to the upload directory.

Replit-Commit-Author: Agent
Replit-Commit-Session-Id: ed7474f6-eba3-49be-ae95-2623f31fe374
Replit-Commit-Checkpoint-Type: full_checkpoint
Replit-Commit-Event-Id: 572a3a38-eff6-4d42-9317-9a9c6948483d
Replit-Commit-Screenshot-Url: https://storage.googleapis.com/screenshot-production-us-central1/9eca0e28-34a0-4418-9f5c-60e618813417/ed7474f6-eba3-49be-ae95-2623f31fe374/gLpUmJT
Replit-Helium-Checkpoint-Created: true
</commit_message>
<xml_diff>
--- a/artifacts/api-server/artifacts/api-server/uploads/assets/5/manuscript_6x9.docx
+++ b/artifacts/api-server/artifacts/api-server/uploads/assets/5/manuscript_6x9.docx
@@ -380,14 +380,14 @@
       </w:r>
     </w:p>
     <w:p>
-      <w:bookmarkStart w:id="4621" w:name="chapter_1"/>
+      <w:bookmarkStart w:id="93993" w:name="chapter_1"/>
       <w:pPr>
         <w:pStyle w:val="Heading1"/>
       </w:pPr>
       <w:r>
         <w:t>Session 1: Entering the Investigation</w:t>
       </w:r>
-      <w:bookmarkEnd w:id="4621"/>
+      <w:bookmarkEnd w:id="93993"/>
     </w:p>
     <w:p>
       <w:pPr>
@@ -726,14 +726,14 @@
       </w:r>
     </w:p>
     <w:p>
-      <w:bookmarkStart w:id="3361" w:name="chapter_2"/>
+      <w:bookmarkStart w:id="38953" w:name="chapter_2"/>
       <w:pPr>
         <w:pStyle w:val="Heading1"/>
       </w:pPr>
       <w:r>
         <w:t>Session 2: Can We Trust the Biographies of Jesus?</w:t>
       </w:r>
-      <w:bookmarkEnd w:id="3361"/>
+      <w:bookmarkEnd w:id="38953"/>
     </w:p>
     <w:p>
       <w:pPr>
@@ -1072,14 +1072,14 @@
       </w:r>
     </w:p>
     <w:p>
-      <w:bookmarkStart w:id="70661" w:name="chapter_3"/>
+      <w:bookmarkStart w:id="10114" w:name="chapter_3"/>
       <w:pPr>
         <w:pStyle w:val="Heading1"/>
       </w:pPr>
       <w:r>
         <w:t>Session 3: Who Did Jesus Think He Was?</w:t>
       </w:r>
-      <w:bookmarkEnd w:id="70661"/>
+      <w:bookmarkEnd w:id="10114"/>
     </w:p>
     <w:p>
       <w:pPr>
@@ -1418,14 +1418,14 @@
       </w:r>
     </w:p>
     <w:p>
-      <w:bookmarkStart w:id="9764" w:name="chapter_4"/>
+      <w:bookmarkStart w:id="62632" w:name="chapter_4"/>
       <w:pPr>
         <w:pStyle w:val="Heading1"/>
       </w:pPr>
       <w:r>
         <w:t>Session 4: Did Jesus Really Die and Rise?</w:t>
       </w:r>
-      <w:bookmarkEnd w:id="9764"/>
+      <w:bookmarkEnd w:id="62632"/>
     </w:p>
     <w:p>
       <w:pPr>
@@ -1764,14 +1764,14 @@
       </w:r>
     </w:p>
     <w:p>
-      <w:bookmarkStart w:id="76910" w:name="chapter_5"/>
+      <w:bookmarkStart w:id="32192" w:name="chapter_5"/>
       <w:pPr>
         <w:pStyle w:val="Heading1"/>
       </w:pPr>
       <w:r>
         <w:t>Session 5: Objections, Alternatives, and the Verdict</w:t>
       </w:r>
-      <w:bookmarkEnd w:id="76910"/>
+      <w:bookmarkEnd w:id="32192"/>
     </w:p>
     <w:p>
       <w:pPr>

</xml_diff>

<commit_message>
Improve book upload scanner to handle dynamic page loading
Replaced AI vision extraction with DOM scraping and updated pagination logic to handle AJAX page loading by fingerprinting content changes.

Replit-Commit-Author: Agent
Replit-Commit-Session-Id: ed7474f6-eba3-49be-ae95-2623f31fe374
Replit-Commit-Checkpoint-Type: full_checkpoint
Replit-Commit-Event-Id: 232e0032-e03a-4a89-b8d2-ad87d366f413
Replit-Commit-Screenshot-Url: https://storage.googleapis.com/screenshot-production-us-central1/9eca0e28-34a0-4418-9f5c-60e618813417/ed7474f6-eba3-49be-ae95-2623f31fe374/gLpUmJT
Replit-Helium-Checkpoint-Created: true
</commit_message>
<xml_diff>
--- a/artifacts/api-server/artifacts/api-server/uploads/assets/5/manuscript_6x9.docx
+++ b/artifacts/api-server/artifacts/api-server/uploads/assets/5/manuscript_6x9.docx
@@ -380,14 +380,14 @@
       </w:r>
     </w:p>
     <w:p>
-      <w:bookmarkStart w:id="70312" w:name="chapter_1"/>
+      <w:bookmarkStart w:id="65266" w:name="chapter_1"/>
       <w:pPr>
         <w:pStyle w:val="Heading1"/>
       </w:pPr>
       <w:r>
         <w:t>Session 1: Entering the Investigation</w:t>
       </w:r>
-      <w:bookmarkEnd w:id="70312"/>
+      <w:bookmarkEnd w:id="65266"/>
     </w:p>
     <w:p>
       <w:pPr>
@@ -726,14 +726,14 @@
       </w:r>
     </w:p>
     <w:p>
-      <w:bookmarkStart w:id="57706" w:name="chapter_2"/>
+      <w:bookmarkStart w:id="87961" w:name="chapter_2"/>
       <w:pPr>
         <w:pStyle w:val="Heading1"/>
       </w:pPr>
       <w:r>
         <w:t>Session 2: Can We Trust the Biographies of Jesus?</w:t>
       </w:r>
-      <w:bookmarkEnd w:id="57706"/>
+      <w:bookmarkEnd w:id="87961"/>
     </w:p>
     <w:p>
       <w:pPr>
@@ -1072,14 +1072,14 @@
       </w:r>
     </w:p>
     <w:p>
-      <w:bookmarkStart w:id="3579" w:name="chapter_3"/>
+      <w:bookmarkStart w:id="14585" w:name="chapter_3"/>
       <w:pPr>
         <w:pStyle w:val="Heading1"/>
       </w:pPr>
       <w:r>
         <w:t>Session 3: Who Did Jesus Think He Was?</w:t>
       </w:r>
-      <w:bookmarkEnd w:id="3579"/>
+      <w:bookmarkEnd w:id="14585"/>
     </w:p>
     <w:p>
       <w:pPr>
@@ -1418,14 +1418,14 @@
       </w:r>
     </w:p>
     <w:p>
-      <w:bookmarkStart w:id="94657" w:name="chapter_4"/>
+      <w:bookmarkStart w:id="86009" w:name="chapter_4"/>
       <w:pPr>
         <w:pStyle w:val="Heading1"/>
       </w:pPr>
       <w:r>
         <w:t>Session 4: Did Jesus Really Die and Rise?</w:t>
       </w:r>
-      <w:bookmarkEnd w:id="94657"/>
+      <w:bookmarkEnd w:id="86009"/>
     </w:p>
     <w:p>
       <w:pPr>
@@ -1764,14 +1764,14 @@
       </w:r>
     </w:p>
     <w:p>
-      <w:bookmarkStart w:id="9644" w:name="chapter_5"/>
+      <w:bookmarkStart w:id="2737" w:name="chapter_5"/>
       <w:pPr>
         <w:pStyle w:val="Heading1"/>
       </w:pPr>
       <w:r>
         <w:t>Session 5: Objections, Alternatives, and the Verdict</w:t>
       </w:r>
-      <w:bookmarkEnd w:id="9644"/>
+      <w:bookmarkEnd w:id="2737"/>
     </w:p>
     <w:p>
       <w:pPr>

</xml_diff>